<commit_message>
Headshot hero, Asian Games 2026 photos, remove phone number
- Hero uses the professional headshot; About is text-only
- Photo section rebuilt around Aichi-Nagoya 2026 Asian Games shots
  plus the Worlds 2025 silver; flag ceremony and training photos removed
- Remove phone number and postcode from the page, print CV, data.js
  and both Word CVs; point the Word CV's website link to noahlim.com

Co-Authored-By: Claude Opus 5.5 <noreply@anthropic.com>
</commit_message>
<xml_diff>
--- a/Noah Lim CV.docx
+++ b/Noah Lim CV.docx
@@ -41,7 +41,7 @@
           <w:sz w:val="24"/>
           <w:szCs w:val="24"/>
         </w:rPr>
-        <w:t xml:space="preserve"> | +65 96467502</w:t>
+        <w:t xml:space="preserve"/>
       </w:r>
     </w:p>
     <w:p>
@@ -57,7 +57,7 @@
           <w:sz w:val="24"/>
           <w:szCs w:val="24"/>
         </w:rPr>
-        <w:t>Singapore 299450</w:t>
+        <w:t>Singapore</w:t>
       </w:r>
     </w:p>
     <w:p>
@@ -75,7 +75,7 @@
             <w:sz w:val="24"/>
             <w:szCs w:val="24"/>
           </w:rPr>
-          <w:t>https://noahlim.netlify.app/</w:t>
+          <w:t>https://noahlim.com/</w:t>
         </w:r>
       </w:hyperlink>
     </w:p>

</xml_diff>